<commit_message>
Update the project documents
- AtliQ_Contract_Risk_Analyzer_AI_PRD_v1.1.docx: latest version
- AtliQ_Cost_Estimate_Simple_Updated.xlsx: added (demo running cost from
  measured Claude usage, and the production plan)
- README: the folder description mentions the cost estimate

Co-Authored-By: Claude Opus 5.5 <noreply@anthropic.com>
</commit_message>
<xml_diff>
--- a/Project Documents/AtliQ_Contract_Risk_Analyzer_AI_PRD_v1.1.docx
+++ b/Project Documents/AtliQ_Contract_Risk_Analyzer_AI_PRD_v1.1.docx
@@ -40,78 +40,6 @@
           <w:sz w:val="20"/>
         </w:rPr>
         <w:t>Version 1.1  |  Draft for Review  |  09 Oct 2026</w:t>
-      </w:r>
-    </w:p>
-    <w:tbl>
-      <w:tblPr>
-        <w:tblW w:w="0" w:type="auto"/>
-        <w:jc w:val="center"/>
-        <w:tblLook w:val="04A0" w:firstRow="1" w:lastRow="0" w:firstColumn="1" w:lastColumn="0" w:noHBand="0" w:noVBand="1"/>
-      </w:tblPr>
-      <w:tblGrid>
-        <w:gridCol w:w="10224"/>
-      </w:tblGrid>
-      <w:tr>
-        <w:trPr>
-          <w:jc w:val="center"/>
-        </w:trPr>
-        <w:tc>
-          <w:tcPr>
-            <w:tcW w:w="10224" w:type="dxa"/>
-            <w:tcBorders>
-              <w:top w:val="single" w:sz="4" w:space="0" w:color="A7B0BC"/>
-              <w:left w:val="single" w:sz="4" w:space="0" w:color="A7B0BC"/>
-              <w:bottom w:val="single" w:sz="4" w:space="0" w:color="A7B0BC"/>
-              <w:right w:val="single" w:sz="4" w:space="0" w:color="A7B0BC"/>
-            </w:tcBorders>
-            <w:shd w:val="clear" w:color="auto" w:fill="EAF3FC"/>
-            <w:tcMar>
-              <w:top w:w="180" w:type="dxa"/>
-              <w:left w:w="180" w:type="dxa"/>
-              <w:bottom w:w="180" w:type="dxa"/>
-              <w:right w:w="180" w:type="dxa"/>
-            </w:tcMar>
-          </w:tcPr>
-          <w:p>
-            <w:r>
-              <w:rPr>
-                <w:color w:val="23446D"/>
-                <w:sz w:val="22"/>
-              </w:rPr>
-              <w:t>Purpose: Build a human-in-the-loop AI system that helps AtliQ review contracts faster and more consistently by extracting clauses, identifying risk, checking prior commitments and negotiation precedent, validating the correct legal entity, and producing evidence-backed recommendations for a human decision-maker.</w:t>
-            </w:r>
-          </w:p>
-        </w:tc>
-      </w:tr>
-    </w:tbl>
-    <w:p>
-      <w:pPr>
-        <w:spacing w:after="0"/>
-      </w:pPr>
-    </w:p>
-    <w:p/>
-    <w:p>
-      <w:pPr>
-        <w:pStyle w:val="SmallNote"/>
-      </w:pPr>
-      <w:r>
-        <w:t>Prepared for: AtliQ Contract Review Capstone</w:t>
-      </w:r>
-    </w:p>
-    <w:p>
-      <w:pPr>
-        <w:pStyle w:val="SmallNote"/>
-      </w:pPr>
-      <w:r>
-        <w:t>Product principle: AI recommends and explains; humans approve, negotiate and sign.</w:t>
-      </w:r>
-    </w:p>
-    <w:p>
-      <w:pPr>
-        <w:pStyle w:val="SmallNote"/>
-      </w:pPr>
-      <w:r>
-        <w:t>Revised after Client Meeting 1 (7 Oct 2026). Corrects the persona model, removes commercial thresholds AtliQ does not have, anchors success metrics to the stated baselines, adds clause-coverage, obligation-expiry, brand-safety and client-legitimacy requirements, and adds the Open Questions log. Change log at Appendix B.</w:t>
       </w:r>
     </w:p>
     <w:p>
@@ -340,7 +268,6 @@
         <w:rPr>
           <w:b/>
         </w:rPr>
-        <w:lastRenderedPageBreak/>
         <w:t xml:space="preserve">• </w:t>
       </w:r>
       <w:r>
@@ -574,6 +501,7 @@
               <w:rPr>
                 <w:sz w:val="17"/>
               </w:rPr>
+              <w:lastRenderedPageBreak/>
               <w:t>Author</w:t>
             </w:r>
           </w:p>
@@ -850,7 +778,7 @@
               <w:rPr>
                 <w:sz w:val="17"/>
               </w:rPr>
-              <w:t>Proposed — closed beta Dec 2026, phased production rollout Q1 2027</w:t>
+              <w:t>Proposed — closed beta Jan 2027, phased production rollout Q1 2027</w:t>
             </w:r>
           </w:p>
         </w:tc>
@@ -1414,7 +1342,6 @@
         <w:pStyle w:val="Heading1"/>
       </w:pPr>
       <w:r>
-        <w:lastRenderedPageBreak/>
         <w:t>3. Problem Statement and Background</w:t>
       </w:r>
     </w:p>
@@ -1423,7 +1350,10 @@
         <w:pStyle w:val="Heading2"/>
       </w:pPr>
       <w:r>
-        <w:t>3.1 Two Problems, Not One</w:t>
+        <w:t xml:space="preserve">3.1 </w:t>
+      </w:r>
+      <w:r>
+        <w:t>Problem</w:t>
       </w:r>
     </w:p>
     <w:p>
@@ -1439,7 +1369,11 @@
         <w:t>Review time.</w:t>
       </w:r>
       <w:r>
-        <w:t xml:space="preserve"> Every contract has to be read clause by clause, and that takes about three hours. AtliQ has templates, but they barely help: every counterparty brings its own template and adds its own clauses. There is no universal template, so in practice every contract is a fresh contract, and someone has to go through every clause to make sure nothing will come back to bite AtliQ once the project is running.</w:t>
+        <w:t xml:space="preserve"> Every contract has to be read clause by clause, and that takes about three hours. AtliQ has templates, but they barely help: every counterparty brings its own template and adds its own clauses. There is no universal template, so in </w:t>
+      </w:r>
+      <w:r>
+        <w:lastRenderedPageBreak/>
+        <w:t>practice every contract is a fresh contract, and someone has to go through every clause to make sure nothing will come back to bite AtliQ once the project is running.</w:t>
       </w:r>
     </w:p>
     <w:p>
@@ -1450,7 +1384,7 @@
         <w:t>Distributed context.</w:t>
       </w:r>
       <w:r>
-        <w:t xml:space="preserve"> Rates and contract terms are discussed in parallel on WhatsApp, email, Teams, Slack and phone calls. Every project has its own point of contact and its own channel. An ad hoc call leaves no minutes behind but can still change the terms — a client may quote a budget and then call to ask whether AtliQ can do the same work for less. Those commitments matter at review time.</w:t>
+        <w:t xml:space="preserve"> Rates and contract terms are discussed in parallel on WhatsApp, email, Teams, Slack and phone calls. Every project has its own point of contact and its own channel. An ad hoc call leaves no minutes behind but can still change the terms a client may quote a budget and then call to ask whether AtliQ can do the same work for less. Those commitments matter at review time.</w:t>
       </w:r>
     </w:p>
     <w:p>
@@ -1458,56 +1392,6 @@
         <w:t>Sitting on top of both: contract knowledge and the review itself depend on Karandeep's memory and manual effort.</w:t>
       </w:r>
     </w:p>
-    <w:tbl>
-      <w:tblPr>
-        <w:tblW w:w="0" w:type="auto"/>
-        <w:jc w:val="center"/>
-        <w:tblLook w:val="04A0" w:firstRow="1" w:lastRow="0" w:firstColumn="1" w:lastColumn="0" w:noHBand="0" w:noVBand="1"/>
-      </w:tblPr>
-      <w:tblGrid>
-        <w:gridCol w:w="10224"/>
-      </w:tblGrid>
-      <w:tr>
-        <w:trPr>
-          <w:jc w:val="center"/>
-        </w:trPr>
-        <w:tc>
-          <w:tcPr>
-            <w:tcW w:w="10224" w:type="dxa"/>
-            <w:tcBorders>
-              <w:top w:val="single" w:sz="4" w:space="0" w:color="A7B0BC"/>
-              <w:left w:val="single" w:sz="4" w:space="0" w:color="A7B0BC"/>
-              <w:bottom w:val="single" w:sz="4" w:space="0" w:color="A7B0BC"/>
-              <w:right w:val="single" w:sz="4" w:space="0" w:color="A7B0BC"/>
-            </w:tcBorders>
-            <w:shd w:val="clear" w:color="auto" w:fill="EAF3FC"/>
-            <w:tcMar>
-              <w:top w:w="180" w:type="dxa"/>
-              <w:left w:w="180" w:type="dxa"/>
-              <w:bottom w:w="180" w:type="dxa"/>
-              <w:right w:w="180" w:type="dxa"/>
-            </w:tcMar>
-          </w:tcPr>
-          <w:p>
-            <w:r>
-              <w:rPr>
-                <w:b/>
-                <w:color w:val="23446D"/>
-                <w:sz w:val="22"/>
-              </w:rPr>
-              <w:t>Design consequence.</w:t>
-            </w:r>
-            <w:r>
-              <w:rPr>
-                <w:color w:val="23446D"/>
-                <w:sz w:val="22"/>
-              </w:rPr>
-              <w:t xml:space="preserve"> The costliest failures come from context *outside* the incoming document — a restriction signed two years ago, or a promise made on a phone call. A reviewer that reads only the contract in front of it will miss exactly the risks the client fears most. §8 and §14 state how much of that context V1 covers and what is deliberately deferred.</w:t>
-            </w:r>
-          </w:p>
-        </w:tc>
-      </w:tr>
-    </w:tbl>
     <w:p>
       <w:pPr>
         <w:spacing w:after="0"/>
@@ -2196,10 +2080,13 @@
           <w:p>
             <w:pPr>
               <w:spacing w:after="40"/>
-            </w:pPr>
-            <w:r>
-              <w:rPr>
-                <w:b/>
+              <w:rPr>
+                <w:bCs/>
+              </w:rPr>
+            </w:pPr>
+            <w:r>
+              <w:rPr>
+                <w:bCs/>
                 <w:sz w:val="17"/>
               </w:rPr>
               <w:t>Reviewed</w:t>
@@ -2225,19 +2112,16 @@
           <w:p>
             <w:pPr>
               <w:spacing w:after="40"/>
-            </w:pPr>
-            <w:r>
-              <w:rPr>
-                <w:b/>
+              <w:rPr>
+                <w:bCs/>
+              </w:rPr>
+            </w:pPr>
+            <w:r>
+              <w:rPr>
+                <w:bCs/>
                 <w:sz w:val="17"/>
               </w:rPr>
-              <w:t>The focus of this product.</w:t>
-            </w:r>
-            <w:r>
-              <w:rPr>
-                <w:sz w:val="17"/>
-              </w:rPr>
-              <w:t xml:space="preserve"> Spot what is missing, what works against AtliQ and what is in its favour.</w:t>
+              <w:t>The focus of this product. Spot what is missing, what works against AtliQ and what is in its favour.</w:t>
             </w:r>
           </w:p>
         </w:tc>
@@ -2374,7 +2258,6 @@
     </w:p>
     <w:p>
       <w:r>
-        <w:lastRenderedPageBreak/>
         <w:t>Step by step, review works like this today:</w:t>
       </w:r>
     </w:p>
@@ -2389,13 +2272,7 @@
         <w:t xml:space="preserve">1. </w:t>
       </w:r>
       <w:r>
-        <w:t xml:space="preserve">A client or partner shares the contract, usually by email. There is no internal requester </w:t>
-      </w:r>
-      <w:r>
-        <w:t>,</w:t>
-      </w:r>
-      <w:r>
-        <w:t xml:space="preserve"> the document arrives from outside.</w:t>
+        <w:t>A client or partner shares the contract, usually by email. There is no internal requester; the document arrives from outside.</w:t>
       </w:r>
     </w:p>
     <w:p>
@@ -2462,6 +2339,7 @@
         <w:rPr>
           <w:b/>
         </w:rPr>
+        <w:lastRenderedPageBreak/>
         <w:t xml:space="preserve">6. </w:t>
       </w:r>
       <w:r>
@@ -2580,19 +2458,7 @@
         <w:t>• Time pressure</w:t>
       </w:r>
       <w:r>
-        <w:t xml:space="preserve"> produces shallow review and </w:t>
-      </w:r>
-      <w:r>
-        <w:t xml:space="preserve"> </w:t>
-      </w:r>
-      <w:r>
-        <w:t>looks standard</w:t>
-      </w:r>
-      <w:r>
-        <w:t xml:space="preserve"> </w:t>
-      </w:r>
-      <w:r>
-        <w:t>approvals.</w:t>
+        <w:t xml:space="preserve"> produces shallow review and "looks standard" approvals.</w:t>
       </w:r>
     </w:p>
     <w:p>
@@ -2692,7 +2558,6 @@
         <w:pStyle w:val="Heading2"/>
       </w:pPr>
       <w:r>
-        <w:lastRenderedPageBreak/>
         <w:t>3.6 Job To Be Done</w:t>
       </w:r>
     </w:p>
@@ -3058,6 +2923,7 @@
         <w:pStyle w:val="Heading1"/>
       </w:pPr>
       <w:r>
+        <w:lastRenderedPageBreak/>
         <w:t>4. Opportunity and AI Capability Mapping</w:t>
       </w:r>
     </w:p>
@@ -3202,15 +3068,7 @@
                 <w:bCs/>
                 <w:sz w:val="17"/>
               </w:rPr>
-              <w:t>OCR / Document AI</w:t>
-            </w:r>
-            <w:r>
-              <w:rPr>
-                <w:b/>
-                <w:bCs/>
-                <w:sz w:val="17"/>
-              </w:rPr>
-              <w:t>/Information Extraction</w:t>
+              <w:t>OCR / Document AI/Information Extraction</w:t>
             </w:r>
           </w:p>
         </w:tc>
@@ -3790,19 +3648,11 @@
             <w:pPr>
               <w:spacing w:after="40"/>
             </w:pPr>
-            <w:proofErr w:type="spellStart"/>
             <w:r>
               <w:rPr>
                 <w:sz w:val="17"/>
               </w:rPr>
-              <w:t>Recognise</w:t>
-            </w:r>
-            <w:proofErr w:type="spellEnd"/>
-            <w:r>
-              <w:rPr>
-                <w:sz w:val="17"/>
-              </w:rPr>
-              <w:t xml:space="preserve"> uncertainty and missing evidence</w:t>
+              <w:t>Recognise uncertainty and missing evidence</w:t>
             </w:r>
           </w:p>
         </w:tc>
@@ -4188,7 +4038,7 @@
               <w:rPr>
                 <w:sz w:val="15"/>
               </w:rPr>
-              <w:t xml:space="preserve"> delay  founder-led multitasking across operations and hiring means nobody gets to focus on one thing.</w:t>
+              <w:t xml:space="preserve"> delay — founder-led multitasking across operations and hiring means nobody gets to focus on one thing.</w:t>
             </w:r>
           </w:p>
         </w:tc>
@@ -4222,22 +4072,7 @@
                 <w:b/>
                 <w:sz w:val="15"/>
               </w:rPr>
-              <w:t xml:space="preserve">Non-user </w:t>
-            </w:r>
-            <w:r>
-              <w:rPr>
-                <w:b/>
-                <w:sz w:val="15"/>
-              </w:rPr>
-              <w:t>-</w:t>
-            </w:r>
-            <w:r>
-              <w:rPr>
-                <w:b/>
-                <w:sz w:val="15"/>
-              </w:rPr>
-              <w:lastRenderedPageBreak/>
-              <w:t>External legal counsel</w:t>
+              <w:t>Non-user — External legal counsel</w:t>
             </w:r>
           </w:p>
         </w:tc>
@@ -4265,15 +4100,7 @@
               <w:rPr>
                 <w:sz w:val="15"/>
               </w:rPr>
-              <w:lastRenderedPageBreak/>
-              <w:t xml:space="preserve">Engaged only when contract size justifies it. Slow, expensive, and it eats into margin. Receives escalations as documents, not </w:t>
-            </w:r>
-            <w:r>
-              <w:rPr>
-                <w:sz w:val="15"/>
-              </w:rPr>
-              <w:lastRenderedPageBreak/>
-              <w:t>as system access.</w:t>
+              <w:t>Engaged only when contract size justifies it. Slow, expensive, and it eats into margin. Receives escalations as documents, not as system access.</w:t>
             </w:r>
           </w:p>
         </w:tc>
@@ -4735,7 +4562,14 @@
               <w:rPr>
                 <w:sz w:val="15"/>
               </w:rPr>
-              <w:t>See how similar clauses were handled in previous AtliQ contracts</w:t>
+              <w:t xml:space="preserve">See how similar clauses were handled in previous AtliQ </w:t>
+            </w:r>
+            <w:r>
+              <w:rPr>
+                <w:sz w:val="15"/>
+              </w:rPr>
+              <w:lastRenderedPageBreak/>
+              <w:t>contracts</w:t>
             </w:r>
           </w:p>
         </w:tc>
@@ -4764,6 +4598,7 @@
               <w:rPr>
                 <w:sz w:val="15"/>
               </w:rPr>
+              <w:lastRenderedPageBreak/>
               <w:t>I do not have to rely on memory while negotiating</w:t>
             </w:r>
           </w:p>
@@ -4793,7 +4628,14 @@
               <w:rPr>
                 <w:sz w:val="15"/>
               </w:rPr>
-              <w:t>The system shows relevant past clauses, negotiation outcomes, source contract, date, and whether the outcome was a standard position or a one-off exception.</w:t>
+              <w:t xml:space="preserve">The system shows relevant past clauses, negotiation outcomes, source contract, date, and whether the outcome was a standard </w:t>
+            </w:r>
+            <w:r>
+              <w:rPr>
+                <w:sz w:val="15"/>
+              </w:rPr>
+              <w:lastRenderedPageBreak/>
+              <w:t>position or a one-off exception.</w:t>
             </w:r>
           </w:p>
         </w:tc>
@@ -4826,6 +4668,7 @@
               <w:rPr>
                 <w:sz w:val="15"/>
               </w:rPr>
+              <w:lastRenderedPageBreak/>
               <w:t>CEO</w:t>
             </w:r>
           </w:p>
@@ -6121,7 +5964,6 @@
         <w:pStyle w:val="Heading1"/>
       </w:pPr>
       <w:r>
-        <w:lastRenderedPageBreak/>
         <w:t>6. Model Strategy</w:t>
       </w:r>
     </w:p>
@@ -6426,7 +6268,14 @@
               <w:rPr>
                 <w:sz w:val="15"/>
               </w:rPr>
-              <w:t>Deterministic rules</w:t>
+              <w:t xml:space="preserve">Deterministic </w:t>
+            </w:r>
+            <w:r>
+              <w:rPr>
+                <w:sz w:val="15"/>
+              </w:rPr>
+              <w:lastRenderedPageBreak/>
+              <w:t>rules</w:t>
             </w:r>
           </w:p>
         </w:tc>
@@ -6454,6 +6303,7 @@
               <w:rPr>
                 <w:sz w:val="15"/>
               </w:rPr>
+              <w:lastRenderedPageBreak/>
               <w:t xml:space="preserve">Versioned entity/geography, required-document and no-go checks. </w:t>
             </w:r>
             <w:r>
@@ -6461,7 +6311,15 @@
                 <w:b/>
                 <w:sz w:val="15"/>
               </w:rPr>
-              <w:t>Scope limit: these rules cover entity, jurisdiction and document completeness only — not commercial terms.</w:t>
+              <w:t xml:space="preserve">Scope limit: these rules cover entity, jurisdiction and </w:t>
+            </w:r>
+            <w:r>
+              <w:rPr>
+                <w:b/>
+                <w:sz w:val="15"/>
+              </w:rPr>
+              <w:lastRenderedPageBreak/>
+              <w:t>document completeness only — not commercial terms.</w:t>
             </w:r>
           </w:p>
         </w:tc>
@@ -6495,6 +6353,7 @@
               <w:rPr>
                 <w:sz w:val="15"/>
               </w:rPr>
+              <w:lastRenderedPageBreak/>
               <w:t>Negotiation positions</w:t>
             </w:r>
           </w:p>
@@ -6903,7 +6762,7 @@
               <w:rPr>
                 <w:sz w:val="15"/>
               </w:rPr>
-              <w:t>Smaller extraction model for routine fields, stronger comparison model for exceptions; candidates evaluated on labelled scenarios; no provider mandated. The client has set no cost ceiling the priority is saving reviewer time, so cost optimisation must never trade away recall on high-severity clauses.</w:t>
+              <w:t>Smaller extraction model for routine fields, stronger comparison model for exceptions; candidates evaluated on labelled scenarios; no provider mandated. The client has set no cost ceiling; the priority is saving reviewer time, so cost optimisation must never trade away recall on high-severity clauses.</w:t>
             </w:r>
           </w:p>
         </w:tc>
@@ -7489,7 +7348,7 @@
               <w:rPr>
                 <w:sz w:val="15"/>
               </w:rPr>
-              <w:t>The system shall assess each material clause and assign a risk level of Low, Medium or High, along with an explanation of why it was flagged.</w:t>
+              <w:t>The system shall assess each material clause and assign a risk level of Low, Medium or High, along with an explanation of why it was flagged. Clause risk levels map to the §10.2 behaviour states (Low → Green, Medium → Amber, High → Red), and "critical risk" elsewhere in this document means a High-severity finding.</w:t>
             </w:r>
           </w:p>
         </w:tc>
@@ -8055,7 +7914,6 @@
               <w:rPr>
                 <w:sz w:val="15"/>
               </w:rPr>
-              <w:lastRenderedPageBreak/>
               <w:t>FR-9</w:t>
             </w:r>
           </w:p>
@@ -8442,7 +8300,7 @@
               <w:rPr>
                 <w:sz w:val="15"/>
               </w:rPr>
-              <w:t>The system shall identify missing information or required internal approvals and route them to the appropriate owner  Finance, CTO or the assigned reviewer.</w:t>
+              <w:t>The system shall identify missing information or required internal approvals and route them to the appropriate owner — Finance, CTO or the assigned reviewer.</w:t>
             </w:r>
           </w:p>
         </w:tc>
@@ -8652,6 +8510,7 @@
               <w:rPr>
                 <w:sz w:val="15"/>
               </w:rPr>
+              <w:lastRenderedPageBreak/>
               <w:t>FR-14</w:t>
             </w:r>
           </w:p>
@@ -9279,7 +9138,7 @@
               <w:rPr>
                 <w:sz w:val="15"/>
               </w:rPr>
-              <w:t>The system shall screen for brand and reputational exposure  publicity and reference rights, asymmetric non-disparagement, and conduct or association obligations and flag findings with quoted clause text.</w:t>
+              <w:t>The system shall screen for brand and reputational exposure  publicity and reference rights, asymmetric non-disparagement, and conduct or association obligations  and flag findings with quoted clause text.</w:t>
             </w:r>
           </w:p>
         </w:tc>
@@ -9639,7 +9498,7 @@
               <w:rPr>
                 <w:sz w:val="15"/>
               </w:rPr>
-              <w:t>The system shall link related documents into a contract family — an SOW to its parent MSA, an NDA to its successor agreement  review the child against the parent's terms, and flag an orphan SOW whose parent cannot be located.</w:t>
+              <w:t>The system shall link related documents into a contract family an SOW to its parent MSA, an NDA to its successor agreement — review the child against the parent's terms, and flag an orphan SOW whose parent cannot be located.</w:t>
             </w:r>
           </w:p>
         </w:tc>
@@ -10209,7 +10068,6 @@
               <w:rPr>
                 <w:sz w:val="15"/>
               </w:rPr>
-              <w:lastRenderedPageBreak/>
               <w:t>Internal confirmations</w:t>
             </w:r>
           </w:p>
@@ -10364,80 +10222,6 @@
                 <w:sz w:val="15"/>
               </w:rPr>
               <w:t>AtliQ's own record of payment defaults, missed cycles and prior disputes</w:t>
-            </w:r>
-          </w:p>
-        </w:tc>
-      </w:tr>
-      <w:tr>
-        <w:trPr>
-          <w:jc w:val="center"/>
-        </w:trPr>
-        <w:tc>
-          <w:tcPr>
-            <w:tcW w:w="1577" w:type="dxa"/>
-            <w:tcBorders>
-              <w:top w:val="single" w:sz="4" w:space="0" w:color="A7B0BC"/>
-              <w:left w:val="single" w:sz="4" w:space="0" w:color="A7B0BC"/>
-              <w:bottom w:val="single" w:sz="4" w:space="0" w:color="A7B0BC"/>
-              <w:right w:val="single" w:sz="4" w:space="0" w:color="A7B0BC"/>
-            </w:tcBorders>
-            <w:tcMar>
-              <w:top w:w="60" w:type="dxa"/>
-              <w:left w:w="70" w:type="dxa"/>
-              <w:bottom w:w="60" w:type="dxa"/>
-              <w:right w:w="70" w:type="dxa"/>
-            </w:tcMar>
-          </w:tcPr>
-          <w:p>
-            <w:pPr>
-              <w:spacing w:after="40"/>
-            </w:pPr>
-            <w:r>
-              <w:rPr>
-                <w:sz w:val="15"/>
-              </w:rPr>
-              <w:t>Meeting minutes (MOMs)</w:t>
-            </w:r>
-          </w:p>
-        </w:tc>
-        <w:tc>
-          <w:tcPr>
-            <w:tcW w:w="7927" w:type="dxa"/>
-            <w:tcBorders>
-              <w:top w:val="single" w:sz="4" w:space="0" w:color="A7B0BC"/>
-              <w:left w:val="single" w:sz="4" w:space="0" w:color="A7B0BC"/>
-              <w:bottom w:val="single" w:sz="4" w:space="0" w:color="A7B0BC"/>
-              <w:right w:val="single" w:sz="4" w:space="0" w:color="A7B0BC"/>
-            </w:tcBorders>
-            <w:tcMar>
-              <w:top w:w="60" w:type="dxa"/>
-              <w:left w:w="70" w:type="dxa"/>
-              <w:bottom w:w="60" w:type="dxa"/>
-              <w:right w:w="70" w:type="dxa"/>
-            </w:tcMar>
-          </w:tcPr>
-          <w:p>
-            <w:pPr>
-              <w:spacing w:after="40"/>
-            </w:pPr>
-            <w:r>
-              <w:rPr>
-                <w:sz w:val="15"/>
-              </w:rPr>
-              <w:t xml:space="preserve">An AI assistant already logs scheduled meetings and the MOMs go to the client for approval, so they are a structured and consented record of commitments. </w:t>
-            </w:r>
-            <w:r>
-              <w:rPr>
-                <w:b/>
-                <w:sz w:val="15"/>
-              </w:rPr>
-              <w:t>Available but deferred from V1</w:t>
-            </w:r>
-            <w:r>
-              <w:rPr>
-                <w:sz w:val="15"/>
-              </w:rPr>
-              <w:t xml:space="preserve"> — see §14.2.</w:t>
             </w:r>
           </w:p>
         </w:tc>
@@ -10566,6 +10350,7 @@
               <w:rPr>
                 <w:sz w:val="17"/>
               </w:rPr>
+              <w:lastRenderedPageBreak/>
               <w:t>Personal employee demographic data</w:t>
             </w:r>
           </w:p>
@@ -11153,7 +10938,6 @@
               <w:rPr>
                 <w:sz w:val="15"/>
               </w:rPr>
-              <w:lastRenderedPageBreak/>
               <w:t>Performance</w:t>
             </w:r>
           </w:p>
@@ -11431,7 +11215,7 @@
               <w:rPr>
                 <w:sz w:val="15"/>
               </w:rPr>
-              <w:t>Current volume is ~20 contracts per month, seasonal. Support at least 10x that (200/month) without architectural change.</w:t>
+              <w:t>Current volume is 20 contracts per month, seasonal. Support at least 10x that (200/month) without architectural change.</w:t>
             </w:r>
           </w:p>
         </w:tc>
@@ -11588,6 +11372,7 @@
               <w:rPr>
                 <w:sz w:val="15"/>
               </w:rPr>
+              <w:lastRenderedPageBreak/>
               <w:t>Language</w:t>
             </w:r>
           </w:p>
@@ -11679,7 +11464,7 @@
               <w:rPr>
                 <w:sz w:val="15"/>
               </w:rPr>
-              <w:t>MVP: file upload plus tracker import/export. Later: Drive, SharePoint, mailbox sync, e-signature and CRM.</w:t>
+              <w:t xml:space="preserve">MVP: file upload plus tracker import/export. </w:t>
             </w:r>
           </w:p>
         </w:tc>
@@ -12531,7 +12316,7 @@
               <w:rPr>
                 <w:sz w:val="15"/>
               </w:rPr>
-              <w:t>Sources used, model and prompt version, confidence.</w:t>
+              <w:t>Sources used, model and prompt version, confidence, and a standing note that commitments made on calls, WhatsApp, Teams or Slack are not checked in V1.</w:t>
             </w:r>
           </w:p>
         </w:tc>
@@ -12693,14 +12478,7 @@
               <w:rPr>
                 <w:sz w:val="15"/>
               </w:rPr>
-              <w:t xml:space="preserve">Green / low </w:t>
-            </w:r>
-            <w:r>
-              <w:rPr>
-                <w:sz w:val="15"/>
-              </w:rPr>
-              <w:lastRenderedPageBreak/>
-              <w:t>risk</w:t>
+              <w:t>Green / low risk</w:t>
             </w:r>
           </w:p>
         </w:tc>
@@ -12729,7 +12507,6 @@
               <w:rPr>
                 <w:sz w:val="15"/>
               </w:rPr>
-              <w:lastRenderedPageBreak/>
               <w:t>No material deviation and no live conflict found</w:t>
             </w:r>
           </w:p>
@@ -12759,14 +12536,7 @@
               <w:rPr>
                 <w:sz w:val="15"/>
               </w:rPr>
-              <w:t xml:space="preserve">Summarise, cite evidence, recommend normal human approval. Never </w:t>
-            </w:r>
-            <w:r>
-              <w:rPr>
-                <w:sz w:val="15"/>
-              </w:rPr>
-              <w:lastRenderedPageBreak/>
-              <w:t>auto-sign.</w:t>
+              <w:t>Summarise, cite evidence, recommend normal human approval. Never auto-sign.</w:t>
             </w:r>
           </w:p>
         </w:tc>
@@ -12799,7 +12569,6 @@
               <w:rPr>
                 <w:sz w:val="15"/>
               </w:rPr>
-              <w:lastRenderedPageBreak/>
               <w:t>Amber / negotiable</w:t>
             </w:r>
           </w:p>
@@ -13166,7 +12935,15 @@
                 <w:bCs/>
                 <w:sz w:val="15"/>
               </w:rPr>
-              <w:t>Labelled "mutual" or "standard"</w:t>
+              <w:t xml:space="preserve">Labelled </w:t>
+            </w:r>
+            <w:r>
+              <w:rPr>
+                <w:bCs/>
+                <w:sz w:val="15"/>
+              </w:rPr>
+              <w:lastRenderedPageBreak/>
+              <w:t>"mutual" or "standard"</w:t>
             </w:r>
           </w:p>
         </w:tc>
@@ -13194,7 +12971,15 @@
               <w:rPr>
                 <w:sz w:val="15"/>
               </w:rPr>
-              <w:t>The document is presented as a mutual NDA, a standard template or a routine renewal</w:t>
+              <w:lastRenderedPageBreak/>
+              <w:t xml:space="preserve">The document is presented as a mutual NDA, a </w:t>
+            </w:r>
+            <w:r>
+              <w:rPr>
+                <w:sz w:val="15"/>
+              </w:rPr>
+              <w:lastRenderedPageBreak/>
+              <w:t>standard template or a routine renewal</w:t>
             </w:r>
           </w:p>
         </w:tc>
@@ -13222,7 +13007,15 @@
               <w:rPr>
                 <w:sz w:val="15"/>
               </w:rPr>
-              <w:t>Apply the full review unchanged. Scrutiny must never be reduced because of how a document is labelled, and the summary must not describe a contract as low risk on the strength of its label.</w:t>
+              <w:lastRenderedPageBreak/>
+              <w:t xml:space="preserve">Apply the full review unchanged. Scrutiny must never be reduced because </w:t>
+            </w:r>
+            <w:r>
+              <w:rPr>
+                <w:sz w:val="15"/>
+              </w:rPr>
+              <w:lastRenderedPageBreak/>
+              <w:t>of how a document is labelled, and the summary must not describe a contract as low risk on the strength of its label.</w:t>
             </w:r>
           </w:p>
         </w:tc>
@@ -13256,6 +13049,7 @@
               <w:rPr>
                 <w:sz w:val="15"/>
               </w:rPr>
+              <w:lastRenderedPageBreak/>
               <w:t>Prompt injection / malicious text</w:t>
             </w:r>
           </w:p>
@@ -13512,7 +13306,7 @@
         <w:t xml:space="preserve">13. </w:t>
       </w:r>
       <w:r>
-        <w:t>Primary reviewer and secondary reviewer where assigned accepts, edits, rejects or escalates each material finding.</w:t>
+        <w:t>Primary reviewer, and secondary reviewer where assigned, accepts, edits, rejects or escalates each material finding.</w:t>
       </w:r>
     </w:p>
     <w:p>
@@ -13821,14 +13615,7 @@
               <w:rPr>
                 <w:sz w:val="15"/>
               </w:rPr>
-              <w:t xml:space="preserve">Contract received + </w:t>
-            </w:r>
-            <w:r>
-              <w:rPr>
-                <w:sz w:val="15"/>
-              </w:rPr>
-              <w:lastRenderedPageBreak/>
-              <w:t>metadata</w:t>
+              <w:t>Contract received + metadata</w:t>
             </w:r>
           </w:p>
         </w:tc>
@@ -13857,15 +13644,7 @@
               <w:rPr>
                 <w:sz w:val="15"/>
               </w:rPr>
-              <w:lastRenderedPageBreak/>
-              <w:t xml:space="preserve">Clauses, role, entity, terms, </w:t>
-            </w:r>
-            <w:r>
-              <w:rPr>
-                <w:sz w:val="15"/>
-              </w:rPr>
-              <w:lastRenderedPageBreak/>
-              <w:t>coverage</w:t>
+              <w:t>Clauses, role, entity, terms, coverage</w:t>
             </w:r>
           </w:p>
         </w:tc>
@@ -13894,7 +13673,6 @@
               <w:rPr>
                 <w:sz w:val="15"/>
               </w:rPr>
-              <w:lastRenderedPageBreak/>
               <w:t>Policy + signed contracts + live obligations + precedent</w:t>
             </w:r>
           </w:p>
@@ -14386,7 +14164,14 @@
               <w:rPr>
                 <w:sz w:val="15"/>
               </w:rPr>
-              <w:t>Product + Legal owner</w:t>
+              <w:t xml:space="preserve">Product + Legal </w:t>
+            </w:r>
+            <w:r>
+              <w:rPr>
+                <w:sz w:val="15"/>
+              </w:rPr>
+              <w:lastRenderedPageBreak/>
+              <w:t>owner</w:t>
             </w:r>
           </w:p>
         </w:tc>
@@ -14421,6 +14206,7 @@
                 <w:b/>
                 <w:sz w:val="15"/>
               </w:rPr>
+              <w:lastRenderedPageBreak/>
               <w:t>Incomplete review presented as complete</w:t>
             </w:r>
           </w:p>
@@ -16083,7 +15869,6 @@
         <w:pStyle w:val="Heading1"/>
       </w:pPr>
       <w:r>
-        <w:lastRenderedPageBreak/>
         <w:t>12. Eval Criteria</w:t>
       </w:r>
     </w:p>
@@ -16259,10 +16044,13 @@
           <w:p>
             <w:pPr>
               <w:spacing w:after="40"/>
-            </w:pPr>
-            <w:r>
-              <w:rPr>
-                <w:b/>
+              <w:rPr>
+                <w:bCs/>
+              </w:rPr>
+            </w:pPr>
+            <w:r>
+              <w:rPr>
+                <w:bCs/>
                 <w:sz w:val="15"/>
               </w:rPr>
               <w:t>Clause coverage</w:t>
@@ -16513,6 +16301,7 @@
               <w:rPr>
                 <w:sz w:val="15"/>
               </w:rPr>
+              <w:lastRenderedPageBreak/>
               <w:t>Entity-rule accuracy</w:t>
             </w:r>
           </w:p>
@@ -16994,17 +16783,6 @@
       <w:pPr>
         <w:spacing w:after="0"/>
       </w:pPr>
-    </w:p>
-    <w:p>
-      <w:r>
-        <w:rPr>
-          <w:b/>
-        </w:rPr>
-        <w:t>Eval data note.</w:t>
-      </w:r>
-      <w:r>
-        <w:t xml:space="preserve"> The supplied dataset contains 17 of the 30 signed contracts in the tracker. Synthetic contracts will be generated for edge cases the dataset misses  particularly dated obligation conflicts, label-invariance pairs and degraded-OCR documents.</w:t>
-      </w:r>
     </w:p>
     <w:p>
       <w:pPr>
@@ -17200,7 +16978,7 @@
               <w:rPr>
                 <w:sz w:val="15"/>
               </w:rPr>
-              <w:t>Percentage of submitted contracts for which one AI review gives the human reviewer enough evidence to make the next decision  sign, redline, internal confirm, counsel or reject without additional manual clause hunting, AND the review passes subsequent critical-risk audit, AND clause coverage met threshold.</w:t>
+              <w:t>Percentage of submitted contracts for which one AI review gives the human reviewer enough evidence to make the next decision — sign, redline, internal confirm, counsel or reject — without additional manual clause hunting, AND the review passes subsequent critical-risk audit, AND clause coverage met threshold.</w:t>
             </w:r>
           </w:p>
         </w:tc>
@@ -17252,13 +17030,7 @@
     </w:p>
     <w:p>
       <w:r>
-        <w:t>All targets are stated against the baselines AtliQ gave in Client Meeting 1</w:t>
-      </w:r>
-      <w:r>
-        <w:t xml:space="preserve"> by Aakash</w:t>
-      </w:r>
-      <w:r>
-        <w:t>.</w:t>
+        <w:t>All targets are stated against the baselines AtliQ gave in Client Meeting 1 by Aakash.</w:t>
       </w:r>
     </w:p>
     <w:tbl>
@@ -17804,7 +17576,6 @@
               <w:rPr>
                 <w:sz w:val="15"/>
               </w:rPr>
-              <w:lastRenderedPageBreak/>
               <w:t>Quality</w:t>
             </w:r>
           </w:p>
@@ -18011,6 +17782,127 @@
                 <w:sz w:val="15"/>
               </w:rPr>
               <w:t>≥ 85% by month 3</w:t>
+            </w:r>
+          </w:p>
+        </w:tc>
+      </w:tr>
+      <w:tr>
+        <w:trPr>
+          <w:jc w:val="center"/>
+        </w:trPr>
+        <w:tc>
+          <w:tcPr>
+            <w:tcW w:w="751" w:type="dxa"/>
+            <w:tcBorders>
+              <w:top w:val="single" w:sz="4" w:space="0" w:color="A7B0BC"/>
+              <w:left w:val="single" w:sz="4" w:space="0" w:color="A7B0BC"/>
+              <w:bottom w:val="single" w:sz="4" w:space="0" w:color="A7B0BC"/>
+              <w:right w:val="single" w:sz="4" w:space="0" w:color="A7B0BC"/>
+            </w:tcBorders>
+            <w:shd w:val="clear" w:color="auto" w:fill="F4F6F9"/>
+            <w:tcMar>
+              <w:top w:w="60" w:type="dxa"/>
+              <w:left w:w="70" w:type="dxa"/>
+              <w:bottom w:w="60" w:type="dxa"/>
+              <w:right w:w="70" w:type="dxa"/>
+            </w:tcMar>
+          </w:tcPr>
+          <w:p>
+            <w:pPr>
+              <w:spacing w:after="40"/>
+            </w:pPr>
+            <w:r>
+              <w:rPr>
+                <w:sz w:val="15"/>
+              </w:rPr>
+              <w:t>Adoption</w:t>
+            </w:r>
+          </w:p>
+        </w:tc>
+        <w:tc>
+          <w:tcPr>
+            <w:tcW w:w="3120" w:type="dxa"/>
+            <w:tcBorders>
+              <w:top w:val="single" w:sz="4" w:space="0" w:color="A7B0BC"/>
+              <w:left w:val="single" w:sz="4" w:space="0" w:color="A7B0BC"/>
+              <w:bottom w:val="single" w:sz="4" w:space="0" w:color="A7B0BC"/>
+              <w:right w:val="single" w:sz="4" w:space="0" w:color="A7B0BC"/>
+            </w:tcBorders>
+            <w:shd w:val="clear" w:color="auto" w:fill="F4F6F9"/>
+            <w:tcMar>
+              <w:top w:w="60" w:type="dxa"/>
+              <w:left w:w="70" w:type="dxa"/>
+              <w:bottom w:w="60" w:type="dxa"/>
+              <w:right w:w="70" w:type="dxa"/>
+            </w:tcMar>
+          </w:tcPr>
+          <w:p>
+            <w:pPr>
+              <w:spacing w:after="40"/>
+            </w:pPr>
+            <w:r>
+              <w:rPr>
+                <w:sz w:val="15"/>
+              </w:rPr>
+              <w:t>Reviews completed by a management reviewer or delegated approver (not KD)</w:t>
+            </w:r>
+          </w:p>
+        </w:tc>
+        <w:tc>
+          <w:tcPr>
+            <w:tcW w:w="2056" w:type="dxa"/>
+            <w:tcBorders>
+              <w:top w:val="single" w:sz="4" w:space="0" w:color="A7B0BC"/>
+              <w:left w:val="single" w:sz="4" w:space="0" w:color="A7B0BC"/>
+              <w:bottom w:val="single" w:sz="4" w:space="0" w:color="A7B0BC"/>
+              <w:right w:val="single" w:sz="4" w:space="0" w:color="A7B0BC"/>
+            </w:tcBorders>
+            <w:shd w:val="clear" w:color="auto" w:fill="F4F6F9"/>
+            <w:tcMar>
+              <w:top w:w="60" w:type="dxa"/>
+              <w:left w:w="70" w:type="dxa"/>
+              <w:bottom w:w="60" w:type="dxa"/>
+              <w:right w:w="70" w:type="dxa"/>
+            </w:tcMar>
+          </w:tcPr>
+          <w:p>
+            <w:pPr>
+              <w:spacing w:after="40"/>
+            </w:pPr>
+            <w:r>
+              <w:rPr>
+                <w:sz w:val="15"/>
+              </w:rPr>
+              <w:t>0</w:t>
+            </w:r>
+          </w:p>
+        </w:tc>
+        <w:tc>
+          <w:tcPr>
+            <w:tcW w:w="3688" w:type="dxa"/>
+            <w:tcBorders>
+              <w:top w:val="single" w:sz="4" w:space="0" w:color="A7B0BC"/>
+              <w:left w:val="single" w:sz="4" w:space="0" w:color="A7B0BC"/>
+              <w:bottom w:val="single" w:sz="4" w:space="0" w:color="A7B0BC"/>
+              <w:right w:val="single" w:sz="4" w:space="0" w:color="A7B0BC"/>
+            </w:tcBorders>
+            <w:shd w:val="clear" w:color="auto" w:fill="F4F6F9"/>
+            <w:tcMar>
+              <w:top w:w="60" w:type="dxa"/>
+              <w:left w:w="70" w:type="dxa"/>
+              <w:bottom w:w="60" w:type="dxa"/>
+              <w:right w:w="70" w:type="dxa"/>
+            </w:tcMar>
+          </w:tcPr>
+          <w:p>
+            <w:pPr>
+              <w:spacing w:after="40"/>
+            </w:pPr>
+            <w:r>
+              <w:rPr>
+                <w:sz w:val="15"/>
+              </w:rPr>
+              <w:t>≥ 30% by month 6</w:t>
             </w:r>
           </w:p>
         </w:tc>
@@ -18150,7 +18042,7 @@
         <w:t>Capacity context:</w:t>
       </w:r>
       <w:r>
-        <w:t xml:space="preserve"> ~20 contracts per month, varying by season holidays and Ramzan (when UAE clients are away) bring it down. This is a capacity planning figure, not a target to grow.</w:t>
+        <w:t xml:space="preserve"> ~20 contracts per month, varying by season — holidays and Ramzan (when UAE clients are away) bring it down. This is a capacity planning figure, not a target to grow.</w:t>
       </w:r>
     </w:p>
     <w:p>
@@ -18163,6 +18055,7 @@
         <w:pStyle w:val="Heading1"/>
       </w:pPr>
       <w:r>
+        <w:lastRenderedPageBreak/>
         <w:t>14. Scope and MVP Boundary</w:t>
       </w:r>
     </w:p>
@@ -19570,7 +19463,7 @@
               <w:rPr>
                 <w:sz w:val="15"/>
               </w:rPr>
-              <w:t xml:space="preserve"> labelled risk, coverage, citation, entity, conflict, temporal, privacy and injection evaluations .</w:t>
+              <w:t xml:space="preserve"> labelled risk, coverage, citation, entity, conflict, temporal, privacy and injection evaluations pass, at the §12 launch thresholds where defined.</w:t>
             </w:r>
           </w:p>
         </w:tc>
@@ -19644,7 +19537,7 @@
               <w:rPr>
                 <w:sz w:val="15"/>
               </w:rPr>
-              <w:t xml:space="preserve"> at least 30 varied cases compared, or an approved equivalent sample; zero severe trust incidents.</w:t>
+              <w:t xml:space="preserve"> at least 30 varied cases compared — the ~10 live contracts expected in the two-week window at ~20 per month, topped up with historical signed contracts — or an approved equivalent sample; zero severe trust incidents.</w:t>
             </w:r>
           </w:p>
         </w:tc>
@@ -19678,6 +19571,7 @@
               <w:rPr>
                 <w:sz w:val="15"/>
               </w:rPr>
+              <w:lastRenderedPageBreak/>
               <w:t>3. Closed beta</w:t>
             </w:r>
           </w:p>
@@ -19720,7 +19614,7 @@
               <w:rPr>
                 <w:sz w:val="15"/>
               </w:rPr>
-              <w:t xml:space="preserve"> DRRR ≥ 70%, reviewer usefulness ≥ 4/5, clause coverage ≥ 99%, guardrails green for 4 weeks.</w:t>
+              <w:t xml:space="preserve"> DRRR ≥ 70%, recommendation usefulness ≥ 80% (§12), clause coverage ≥ 99%, guardrails green for 4 weeks.</w:t>
             </w:r>
           </w:p>
         </w:tc>
@@ -20329,7 +20223,7 @@
               <w:rPr>
                 <w:sz w:val="17"/>
               </w:rPr>
-              <w:t>M4 — Ingestion, extraction, coverage accounting and entity-rule prototype</w:t>
+              <w:t>M3 — Ingestion, extraction, coverage accounting and entity-rule prototype</w:t>
             </w:r>
           </w:p>
         </w:tc>
@@ -20419,7 +20313,7 @@
               <w:rPr>
                 <w:sz w:val="17"/>
               </w:rPr>
-              <w:t>M5 — RAG, precedent and dated obligation retrieval</w:t>
+              <w:t>M4 — RAG, precedent and dated obligation retrieval</w:t>
             </w:r>
           </w:p>
         </w:tc>
@@ -20510,7 +20404,7 @@
               <w:rPr>
                 <w:sz w:val="17"/>
               </w:rPr>
-              <w:t>M6 — Review UI, roles, delegation, feedback loop and audit logging</w:t>
+              <w:t>M5 — Review UI, roles, delegation, feedback loop and audit logging</w:t>
             </w:r>
           </w:p>
         </w:tc>
@@ -20600,7 +20494,7 @@
               <w:rPr>
                 <w:sz w:val="17"/>
               </w:rPr>
-              <w:t>M7 — Offline eval and red-team</w:t>
+              <w:t>M6 — Offline eval and red-team</w:t>
             </w:r>
           </w:p>
         </w:tc>
@@ -20691,8 +20585,7 @@
               <w:rPr>
                 <w:sz w:val="17"/>
               </w:rPr>
-              <w:lastRenderedPageBreak/>
-              <w:t>M8 — Shadow mode</w:t>
+              <w:t>M7 — Shadow mode</w:t>
             </w:r>
           </w:p>
         </w:tc>
@@ -20782,7 +20675,7 @@
               <w:rPr>
                 <w:sz w:val="17"/>
               </w:rPr>
-              <w:t>M9 — Closed beta</w:t>
+              <w:t>M8 — Closed beta</w:t>
             </w:r>
           </w:p>
         </w:tc>
@@ -20811,7 +20704,7 @@
               <w:rPr>
                 <w:sz w:val="17"/>
               </w:rPr>
-              <w:t>Proposed Dec 2026</w:t>
+              <w:t>Proposed Jan 2027</w:t>
             </w:r>
           </w:p>
         </w:tc>
@@ -20873,7 +20766,7 @@
               <w:rPr>
                 <w:sz w:val="17"/>
               </w:rPr>
-              <w:t>M10 — Phased production rollout</w:t>
+              <w:t>M9 — Phased production rollout</w:t>
             </w:r>
           </w:p>
         </w:tc>
@@ -20950,6 +20843,7 @@
         <w:pStyle w:val="Heading1"/>
       </w:pPr>
       <w:r>
+        <w:lastRenderedPageBreak/>
         <w:t>17. Open Questions and Assumptions Log</w:t>
       </w:r>
     </w:p>
@@ -21198,7 +21092,7 @@
               <w:rPr>
                 <w:sz w:val="15"/>
               </w:rPr>
-              <w:t>, split by dispute work vs complex contracts. The cost case and the §13.2 cost metric both depend on it.</w:t>
+              <w:t>, split by dispute work vs complex contracts. The ROI case depends on it, and §13.2 cannot carry a cost metric until it is known.</w:t>
             </w:r>
           </w:p>
         </w:tc>
@@ -21285,7 +21179,7 @@
               <w:rPr>
                 <w:sz w:val="15"/>
               </w:rPr>
-              <w:t>Confirmed figure to be posted on the Discord capstone channel. Until then the cost metric has a baseline of "TBC" and is excluded from launch gates.</w:t>
+              <w:t>Confirmed figure to be posted on the Discord capstone channel. Until then counsel spend stays "TBC" (§2), and no cost metric is included in §13.2 or the launch gates.</w:t>
             </w:r>
           </w:p>
         </w:tc>
@@ -21753,7 +21647,7 @@
               <w:rPr>
                 <w:sz w:val="15"/>
               </w:rPr>
-              <w:t>Rationale and mitigation in §14.2. Mailbox sync is the first V2 increment. Review output states the limitation explicitly.</w:t>
+              <w:t>Rationale in §3.1; deferral listed in §14.2. Mailbox sync is the first V2 increment. Review output states the limitation explicitly (§10.1 audit footer).</w:t>
             </w:r>
           </w:p>
         </w:tc>
@@ -22853,7 +22747,6 @@
                 <w:b/>
                 <w:sz w:val="15"/>
               </w:rPr>
-              <w:lastRenderedPageBreak/>
               <w:t>Robin AI</w:t>
             </w:r>
           </w:p>
@@ -23164,6 +23057,7 @@
                 <w:color w:val="FFFFFF"/>
                 <w:sz w:val="18"/>
               </w:rPr>
+              <w:lastRenderedPageBreak/>
               <w:t>#</w:t>
             </w:r>
           </w:p>
@@ -23516,7 +23410,7 @@
               <w:rPr>
                 <w:sz w:val="15"/>
               </w:rPr>
-              <w:t>Two of the five "safe to sign" conditions in §6.2 of the notes, absent from v1.0.</w:t>
+              <w:t>Two of the five "safe to sign" conditions in §6.2 of the Client Meeting 1 session notes, absent from v1.0.</w:t>
             </w:r>
           </w:p>
         </w:tc>
@@ -24909,7 +24803,6 @@
               <w:rPr>
                 <w:sz w:val="15"/>
               </w:rPr>
-              <w:lastRenderedPageBreak/>
               <w:t>18</w:t>
             </w:r>
           </w:p>
@@ -25033,7 +24926,7 @@
         <w:color w:val="5B6573"/>
         <w:sz w:val="16"/>
       </w:rPr>
-      <w:t>AtliQ Contract Risk Analyzer — AI PRD v1.0</w:t>
+      <w:t>AtliQ Contract Risk Analyzer — AI PRD v1.1</w:t>
     </w:r>
   </w:p>
 </w:ftr>
@@ -25895,6 +25788,7 @@
   <w:style w:type="character" w:default="1" w:styleId="DefaultParagraphFont">
     <w:name w:val="Default Paragraph Font"/>
     <w:uiPriority w:val="1"/>
+    <w:semiHidden/>
     <w:unhideWhenUsed/>
   </w:style>
   <w:style w:type="table" w:default="1" w:styleId="TableNormal">

</xml_diff>